<commit_message>
docs: atualiza RF04 com regra de remocao de taxa de servico
</commit_message>
<xml_diff>
--- a/docs/requisitos/GASTRA_Matriz_Rastreabilidade.docx
+++ b/docs/requisitos/GASTRA_Matriz_Rastreabilidade.docx
@@ -367,6 +367,27 @@
               </w:rPr>
               <w:t>; UC10</w:t>
             </w:r>
+            <w:r>
+              <w:rPr>
+                <w:sz w:val="18"/>
+                <w:szCs w:val="18"/>
+              </w:rPr>
+              <w:t>; ENT01</w:t>
+            </w:r>
+            <w:r>
+              <w:rPr>
+                <w:sz w:val="18"/>
+                <w:szCs w:val="18"/>
+              </w:rPr>
+              <w:t>; ENT04</w:t>
+            </w:r>
+            <w:r>
+              <w:rPr>
+                <w:sz w:val="18"/>
+                <w:szCs w:val="18"/>
+              </w:rPr>
+              <w:t>; REL02; REL03</w:t>
+            </w:r>
           </w:p>
         </w:tc>
         <w:tc>
@@ -511,6 +532,13 @@
               </w:rPr>
               <w:t>; UC11</w:t>
             </w:r>
+            <w:r>
+              <w:rPr>
+                <w:sz w:val="18"/>
+                <w:szCs w:val="18"/>
+              </w:rPr>
+              <w:t>; ENT01</w:t>
+            </w:r>
           </w:p>
         </w:tc>
         <w:tc>
@@ -655,6 +683,20 @@
               </w:rPr>
               <w:t>; UC12</w:t>
             </w:r>
+            <w:r>
+              <w:rPr>
+                <w:sz w:val="18"/>
+                <w:szCs w:val="18"/>
+              </w:rPr>
+              <w:t>; ENT06; REL</w:t>
+            </w:r>
+            <w:r>
+              <w:rPr>
+                <w:sz w:val="18"/>
+                <w:szCs w:val="18"/>
+              </w:rPr>
+              <w:t>04; REL05</w:t>
+            </w:r>
           </w:p>
         </w:tc>
         <w:tc>
@@ -748,7 +790,35 @@
                 <w:sz w:val="18"/>
                 <w:szCs w:val="18"/>
               </w:rPr>
-              <w:t>O sistema deve permitir ao Garçom fechar a comanda, calculando o valor total com taxa de serviço.</w:t>
+              <w:t xml:space="preserve">O sistema deve permitir ao Garçom fechar a comanda, calculando o valor total com </w:t>
+            </w:r>
+            <w:r>
+              <w:rPr>
+                <w:sz w:val="18"/>
+                <w:szCs w:val="18"/>
+              </w:rPr>
+              <w:t xml:space="preserve">ou sem </w:t>
+            </w:r>
+            <w:r>
+              <w:rPr>
+                <w:sz w:val="18"/>
+                <w:szCs w:val="18"/>
+              </w:rPr>
+              <w:t>taxa de serviço</w:t>
+            </w:r>
+            <w:r>
+              <w:rPr>
+                <w:sz w:val="18"/>
+                <w:szCs w:val="18"/>
+              </w:rPr>
+              <w:t xml:space="preserve"> (mediante solicitação do cliente)</w:t>
+            </w:r>
+            <w:r>
+              <w:rPr>
+                <w:sz w:val="18"/>
+                <w:szCs w:val="18"/>
+              </w:rPr>
+              <w:t>.</w:t>
             </w:r>
           </w:p>
         </w:tc>
@@ -798,6 +868,20 @@
                 <w:szCs w:val="18"/>
               </w:rPr>
               <w:t>; UC14</w:t>
+            </w:r>
+            <w:r>
+              <w:rPr>
+                <w:sz w:val="18"/>
+                <w:szCs w:val="18"/>
+              </w:rPr>
+              <w:t>; ENT04</w:t>
+            </w:r>
+            <w:r>
+              <w:rPr>
+                <w:sz w:val="18"/>
+                <w:szCs w:val="18"/>
+              </w:rPr>
+              <w:t>; ENT06</w:t>
             </w:r>
           </w:p>
         </w:tc>
@@ -959,6 +1043,13 @@
               </w:rPr>
               <w:t>; UC19</w:t>
             </w:r>
+            <w:r>
+              <w:rPr>
+                <w:sz w:val="18"/>
+                <w:szCs w:val="18"/>
+              </w:rPr>
+              <w:t>; ENT05</w:t>
+            </w:r>
           </w:p>
         </w:tc>
         <w:tc>
@@ -1089,6 +1180,12 @@
             <w:vAlign w:val="center"/>
           </w:tcPr>
           <w:p>
+            <w:pPr>
+              <w:rPr>
+                <w:sz w:val="18"/>
+                <w:szCs w:val="18"/>
+              </w:rPr>
+            </w:pPr>
             <w:r>
               <w:rPr>
                 <w:sz w:val="18"/>
@@ -1109,6 +1206,34 @@
                 <w:szCs w:val="18"/>
               </w:rPr>
               <w:t>15</w:t>
+            </w:r>
+            <w:r>
+              <w:rPr>
+                <w:sz w:val="18"/>
+                <w:szCs w:val="18"/>
+              </w:rPr>
+              <w:t>;</w:t>
+            </w:r>
+            <w:r>
+              <w:rPr>
+                <w:sz w:val="18"/>
+                <w:szCs w:val="18"/>
+              </w:rPr>
+              <w:t xml:space="preserve"> ENT02</w:t>
+            </w:r>
+            <w:r>
+              <w:rPr>
+                <w:sz w:val="18"/>
+                <w:szCs w:val="18"/>
+              </w:rPr>
+              <w:t>; ENT07</w:t>
+            </w:r>
+            <w:r>
+              <w:rPr>
+                <w:sz w:val="18"/>
+                <w:szCs w:val="18"/>
+              </w:rPr>
+              <w:t>; REL06; REL07</w:t>
             </w:r>
           </w:p>
         </w:tc>
@@ -1261,6 +1386,20 @@
               </w:rPr>
               <w:t>; UC22</w:t>
             </w:r>
+            <w:r>
+              <w:rPr>
+                <w:sz w:val="18"/>
+                <w:szCs w:val="18"/>
+              </w:rPr>
+              <w:t>; ENT02</w:t>
+            </w:r>
+            <w:r>
+              <w:rPr>
+                <w:sz w:val="18"/>
+                <w:szCs w:val="18"/>
+              </w:rPr>
+              <w:t>; ENT07</w:t>
+            </w:r>
           </w:p>
         </w:tc>
         <w:tc>
@@ -1391,12 +1530,39 @@
             <w:vAlign w:val="center"/>
           </w:tcPr>
           <w:p>
+            <w:pPr>
+              <w:rPr>
+                <w:sz w:val="18"/>
+                <w:szCs w:val="18"/>
+              </w:rPr>
+            </w:pPr>
             <w:r>
               <w:rPr>
                 <w:sz w:val="18"/>
                 <w:szCs w:val="18"/>
               </w:rPr>
               <w:t>US03; RN03</w:t>
+            </w:r>
+            <w:r>
+              <w:rPr>
+                <w:sz w:val="18"/>
+                <w:szCs w:val="18"/>
+              </w:rPr>
+              <w:t>; ENT02</w:t>
+            </w:r>
+            <w:r>
+              <w:rPr>
+                <w:sz w:val="18"/>
+                <w:szCs w:val="18"/>
+              </w:rPr>
+              <w:t>; ENT07</w:t>
+            </w:r>
+            <w:r>
+              <w:rPr>
+                <w:sz w:val="18"/>
+                <w:szCs w:val="18"/>
+              </w:rPr>
+              <w:t>; REL06; REL07</w:t>
             </w:r>
           </w:p>
         </w:tc>
@@ -1470,6 +1636,7 @@
                 <w:sz w:val="18"/>
                 <w:szCs w:val="18"/>
               </w:rPr>
+              <w:lastRenderedPageBreak/>
               <w:t>RF09</w:t>
             </w:r>
           </w:p>
@@ -1614,7 +1781,6 @@
                 <w:sz w:val="18"/>
                 <w:szCs w:val="18"/>
               </w:rPr>
-              <w:lastRenderedPageBreak/>
               <w:t>RF10</w:t>
             </w:r>
           </w:p>
@@ -2117,6 +2283,13 @@
               </w:rPr>
               <w:t>; UC20</w:t>
             </w:r>
+            <w:r>
+              <w:rPr>
+                <w:sz w:val="18"/>
+                <w:szCs w:val="18"/>
+              </w:rPr>
+              <w:t>; ENT04</w:t>
+            </w:r>
           </w:p>
         </w:tc>
         <w:tc>
@@ -2261,6 +2434,20 @@
               </w:rPr>
               <w:t>; UC13</w:t>
             </w:r>
+            <w:r>
+              <w:rPr>
+                <w:sz w:val="18"/>
+                <w:szCs w:val="18"/>
+              </w:rPr>
+              <w:t>; ENT08</w:t>
+            </w:r>
+            <w:r>
+              <w:rPr>
+                <w:sz w:val="18"/>
+                <w:szCs w:val="18"/>
+              </w:rPr>
+              <w:t>; REL08</w:t>
+            </w:r>
           </w:p>
         </w:tc>
         <w:tc>
@@ -2436,6 +2623,13 @@
               </w:rPr>
               <w:t>UC01</w:t>
             </w:r>
+            <w:r>
+              <w:rPr>
+                <w:sz w:val="18"/>
+                <w:szCs w:val="18"/>
+              </w:rPr>
+              <w:t>; ENT03</w:t>
+            </w:r>
           </w:p>
         </w:tc>
         <w:tc>
@@ -2614,6 +2808,13 @@
               </w:rPr>
               <w:t>; UC02</w:t>
             </w:r>
+            <w:r>
+              <w:rPr>
+                <w:sz w:val="18"/>
+                <w:szCs w:val="18"/>
+              </w:rPr>
+              <w:t>; ENT03</w:t>
+            </w:r>
           </w:p>
         </w:tc>
         <w:tc>
@@ -2808,6 +3009,13 @@
               </w:rPr>
               <w:t>; UC03</w:t>
             </w:r>
+            <w:r>
+              <w:rPr>
+                <w:sz w:val="18"/>
+                <w:szCs w:val="18"/>
+              </w:rPr>
+              <w:t>; ENT03</w:t>
+            </w:r>
           </w:p>
         </w:tc>
         <w:tc>
@@ -2986,6 +3194,13 @@
               </w:rPr>
               <w:t>; UC04</w:t>
             </w:r>
+            <w:r>
+              <w:rPr>
+                <w:sz w:val="18"/>
+                <w:szCs w:val="18"/>
+              </w:rPr>
+              <w:t>; ENT03</w:t>
+            </w:r>
           </w:p>
         </w:tc>
         <w:tc>
@@ -3074,6 +3289,7 @@
                 <w:sz w:val="18"/>
                 <w:szCs w:val="18"/>
               </w:rPr>
+              <w:lastRenderedPageBreak/>
               <w:t>RF19</w:t>
             </w:r>
           </w:p>
@@ -3163,6 +3379,13 @@
                 <w:szCs w:val="18"/>
               </w:rPr>
               <w:t>; UC05</w:t>
+            </w:r>
+            <w:r>
+              <w:rPr>
+                <w:sz w:val="18"/>
+                <w:szCs w:val="18"/>
+              </w:rPr>
+              <w:t>; ENT05</w:t>
             </w:r>
           </w:p>
         </w:tc>
@@ -3342,6 +3565,13 @@
               </w:rPr>
               <w:t>; UC06</w:t>
             </w:r>
+            <w:r>
+              <w:rPr>
+                <w:sz w:val="18"/>
+                <w:szCs w:val="18"/>
+              </w:rPr>
+              <w:t>; ENT05</w:t>
+            </w:r>
           </w:p>
         </w:tc>
         <w:tc>
@@ -3430,7 +3660,6 @@
                 <w:sz w:val="18"/>
                 <w:szCs w:val="18"/>
               </w:rPr>
-              <w:lastRenderedPageBreak/>
               <w:t>RF21</w:t>
             </w:r>
           </w:p>
@@ -3520,6 +3749,13 @@
                 <w:szCs w:val="18"/>
               </w:rPr>
               <w:t>; UC07</w:t>
+            </w:r>
+            <w:r>
+              <w:rPr>
+                <w:sz w:val="18"/>
+                <w:szCs w:val="18"/>
+              </w:rPr>
+              <w:t>; ENT05</w:t>
             </w:r>
           </w:p>
         </w:tc>
@@ -3699,6 +3935,27 @@
               </w:rPr>
               <w:t>; UC08; UC09</w:t>
             </w:r>
+            <w:r>
+              <w:rPr>
+                <w:sz w:val="18"/>
+                <w:szCs w:val="18"/>
+              </w:rPr>
+              <w:t>; ENT05</w:t>
+            </w:r>
+            <w:r>
+              <w:rPr>
+                <w:sz w:val="18"/>
+                <w:szCs w:val="18"/>
+              </w:rPr>
+              <w:t>; ENT09</w:t>
+            </w:r>
+            <w:r>
+              <w:rPr>
+                <w:sz w:val="18"/>
+                <w:szCs w:val="18"/>
+              </w:rPr>
+              <w:t>; REL09</w:t>
+            </w:r>
           </w:p>
         </w:tc>
         <w:tc>
@@ -4556,6 +4813,13 @@
               </w:rPr>
               <w:t>RF02</w:t>
             </w:r>
+            <w:r>
+              <w:rPr>
+                <w:sz w:val="18"/>
+                <w:szCs w:val="18"/>
+              </w:rPr>
+              <w:t>; ENT01</w:t>
+            </w:r>
           </w:p>
         </w:tc>
         <w:tc>
@@ -4693,6 +4957,27 @@
               </w:rPr>
               <w:t>RF03</w:t>
             </w:r>
+            <w:r>
+              <w:rPr>
+                <w:sz w:val="18"/>
+                <w:szCs w:val="18"/>
+              </w:rPr>
+              <w:t>; ENT0</w:t>
+            </w:r>
+            <w:r>
+              <w:rPr>
+                <w:sz w:val="18"/>
+                <w:szCs w:val="18"/>
+              </w:rPr>
+              <w:t>4</w:t>
+            </w:r>
+            <w:r>
+              <w:rPr>
+                <w:sz w:val="18"/>
+                <w:szCs w:val="18"/>
+              </w:rPr>
+              <w:t>; ENT06</w:t>
+            </w:r>
           </w:p>
         </w:tc>
         <w:tc>
@@ -4830,6 +5115,41 @@
               </w:rPr>
               <w:t>RF06; RF07; RF08</w:t>
             </w:r>
+            <w:r>
+              <w:rPr>
+                <w:sz w:val="18"/>
+                <w:szCs w:val="18"/>
+              </w:rPr>
+              <w:t>; REL01</w:t>
+            </w:r>
+            <w:r>
+              <w:rPr>
+                <w:sz w:val="18"/>
+                <w:szCs w:val="18"/>
+              </w:rPr>
+              <w:t xml:space="preserve">; </w:t>
+            </w:r>
+            <w:r>
+              <w:rPr>
+                <w:sz w:val="18"/>
+                <w:szCs w:val="18"/>
+              </w:rPr>
+              <w:t>ENT02</w:t>
+            </w:r>
+            <w:r>
+              <w:rPr>
+                <w:sz w:val="18"/>
+                <w:szCs w:val="18"/>
+              </w:rPr>
+              <w:t xml:space="preserve">; </w:t>
+            </w:r>
+            <w:r>
+              <w:rPr>
+                <w:sz w:val="18"/>
+                <w:szCs w:val="18"/>
+              </w:rPr>
+              <w:t>ENT07; REL07</w:t>
+            </w:r>
           </w:p>
         </w:tc>
         <w:tc>
@@ -4967,6 +5287,13 @@
               </w:rPr>
               <w:t>RNF03</w:t>
             </w:r>
+            <w:r>
+              <w:rPr>
+                <w:sz w:val="18"/>
+                <w:szCs w:val="18"/>
+              </w:rPr>
+              <w:t>; ENT08</w:t>
+            </w:r>
           </w:p>
         </w:tc>
         <w:tc>
@@ -5039,6 +5366,7 @@
                 <w:sz w:val="18"/>
                 <w:szCs w:val="18"/>
               </w:rPr>
+              <w:lastRenderedPageBreak/>
               <w:t>RN05</w:t>
             </w:r>
           </w:p>
@@ -5103,6 +5431,13 @@
                 <w:szCs w:val="18"/>
               </w:rPr>
               <w:t>RNF03; RF09</w:t>
+            </w:r>
+            <w:r>
+              <w:rPr>
+                <w:sz w:val="18"/>
+                <w:szCs w:val="18"/>
+              </w:rPr>
+              <w:t>; ENT08</w:t>
             </w:r>
           </w:p>
         </w:tc>
@@ -5297,6 +5632,13 @@
               </w:rPr>
               <w:t>RF15</w:t>
             </w:r>
+            <w:r>
+              <w:rPr>
+                <w:sz w:val="18"/>
+                <w:szCs w:val="18"/>
+              </w:rPr>
+              <w:t>; ENT03</w:t>
+            </w:r>
           </w:p>
         </w:tc>
         <w:tc>
@@ -5385,7 +5727,6 @@
                 <w:sz w:val="18"/>
                 <w:szCs w:val="18"/>
               </w:rPr>
-              <w:lastRenderedPageBreak/>
               <w:t>RN07</w:t>
             </w:r>
           </w:p>
@@ -5468,6 +5809,13 @@
                 <w:szCs w:val="18"/>
               </w:rPr>
               <w:t>RF16</w:t>
+            </w:r>
+            <w:r>
+              <w:rPr>
+                <w:sz w:val="18"/>
+                <w:szCs w:val="18"/>
+              </w:rPr>
+              <w:t>; ENT03</w:t>
             </w:r>
           </w:p>
         </w:tc>

</xml_diff>